<commit_message>
Insert BankAccount, generate file contract
</commit_message>
<xml_diff>
--- a/src/main/resources/templates/Template_hop_dong_vay.docx
+++ b/src/main/resources/templates/Template_hop_dong_vay.docx
@@ -1,6 +1,6 @@
 
 <file path=word/document.xml><?xml version="1.0" encoding="utf-8"?>
-<w:document xmlns:wpc="http://schemas.microsoft.com/office/word/2010/wordprocessingCanvas" xmlns:cx="http://schemas.microsoft.com/office/drawing/2014/chartex" xmlns:cx1="http://schemas.microsoft.com/office/drawing/2015/9/8/chartex" xmlns:cx2="http://schemas.microsoft.com/office/drawing/2015/10/21/chartex" xmlns:cx3="http://schemas.microsoft.com/office/drawing/2016/5/9/chartex" xmlns:cx4="http://schemas.microsoft.com/office/drawing/2016/5/10/chartex" xmlns:cx5="http://schemas.microsoft.com/office/drawing/2016/5/11/chartex" xmlns:cx6="http://schemas.microsoft.com/office/drawing/2016/5/12/chartex" xmlns:cx7="http://schemas.microsoft.com/office/drawing/2016/5/13/chartex" xmlns:cx8="http://schemas.microsoft.com/office/drawing/2016/5/14/chartex" xmlns:mc="http://schemas.openxmlformats.org/markup-compatibility/2006" xmlns:aink="http://schemas.microsoft.com/office/drawing/2016/ink" xmlns:am3d="http://schemas.microsoft.com/office/drawing/2017/model3d" xmlns:o="urn:schemas-microsoft-com:office:office" xmlns:oel="http://schemas.microsoft.com/office/2019/extlst" xmlns:r="http://schemas.openxmlformats.org/officeDocument/2006/relationships" xmlns:m="http://schemas.openxmlformats.org/officeDocument/2006/math" xmlns:v="urn:schemas-microsoft-com:vml" xmlns:wp14="http://schemas.microsoft.com/office/word/2010/wordprocessingDrawing" xmlns:wp="http://schemas.openxmlformats.org/drawingml/2006/wordprocessingDrawing" xmlns:w10="urn:schemas-microsoft-com:office:word" xmlns:w="http://schemas.openxmlformats.org/wordprocessingml/2006/main" xmlns:w14="http://schemas.microsoft.com/office/word/2010/wordml" xmlns:w15="http://schemas.microsoft.com/office/word/2012/wordml" xmlns:w16cex="http://schemas.microsoft.com/office/word/2018/wordml/cex" xmlns:w16cid="http://schemas.microsoft.com/office/word/2016/wordml/cid" xmlns:w16="http://schemas.microsoft.com/office/word/2018/wordml" xmlns:w16sdtdh="http://schemas.microsoft.com/office/word/2020/wordml/sdtdatahash" xmlns:w16se="http://schemas.microsoft.com/office/word/2015/wordml/symex" xmlns:wpg="http://schemas.microsoft.com/office/word/2010/wordprocessingGroup" xmlns:wpi="http://schemas.microsoft.com/office/word/2010/wordprocessingInk" xmlns:wne="http://schemas.microsoft.com/office/word/2006/wordml" xmlns:wps="http://schemas.microsoft.com/office/word/2010/wordprocessingShape" mc:Ignorable="w14 w15 w16se w16cid w16 w16cex w16sdtdh wp14">
+<w:document xmlns:wpc="http://schemas.microsoft.com/office/word/2010/wordprocessingCanvas" xmlns:cx="http://schemas.microsoft.com/office/drawing/2014/chartex" xmlns:cx1="http://schemas.microsoft.com/office/drawing/2015/9/8/chartex" xmlns:cx2="http://schemas.microsoft.com/office/drawing/2015/10/21/chartex" xmlns:cx3="http://schemas.microsoft.com/office/drawing/2016/5/9/chartex" xmlns:cx4="http://schemas.microsoft.com/office/drawing/2016/5/10/chartex" xmlns:cx5="http://schemas.microsoft.com/office/drawing/2016/5/11/chartex" xmlns:cx6="http://schemas.microsoft.com/office/drawing/2016/5/12/chartex" xmlns:cx7="http://schemas.microsoft.com/office/drawing/2016/5/13/chartex" xmlns:cx8="http://schemas.microsoft.com/office/drawing/2016/5/14/chartex" xmlns:mc="http://schemas.openxmlformats.org/markup-compatibility/2006" xmlns:aink="http://schemas.microsoft.com/office/drawing/2016/ink" xmlns:am3d="http://schemas.microsoft.com/office/drawing/2017/model3d" xmlns:o="urn:schemas-microsoft-com:office:office" xmlns:r="http://schemas.openxmlformats.org/officeDocument/2006/relationships" xmlns:m="http://schemas.openxmlformats.org/officeDocument/2006/math" xmlns:v="urn:schemas-microsoft-com:vml" xmlns:wp14="http://schemas.microsoft.com/office/word/2010/wordprocessingDrawing" xmlns:wp="http://schemas.openxmlformats.org/drawingml/2006/wordprocessingDrawing" xmlns:w10="urn:schemas-microsoft-com:office:word" xmlns:w="http://schemas.openxmlformats.org/wordprocessingml/2006/main" xmlns:w14="http://schemas.microsoft.com/office/word/2010/wordml" xmlns:w15="http://schemas.microsoft.com/office/word/2012/wordml" xmlns:w16cex="http://schemas.microsoft.com/office/word/2018/wordml/cex" xmlns:w16cid="http://schemas.microsoft.com/office/word/2016/wordml/cid" xmlns:w16="http://schemas.microsoft.com/office/word/2018/wordml" xmlns:w16se="http://schemas.microsoft.com/office/word/2015/wordml/symex" xmlns:wpg="http://schemas.microsoft.com/office/word/2010/wordprocessingGroup" xmlns:wpi="http://schemas.microsoft.com/office/word/2010/wordprocessingInk" xmlns:wne="http://schemas.microsoft.com/office/word/2006/wordml" xmlns:wps="http://schemas.microsoft.com/office/word/2010/wordprocessingShape" mc:Ignorable="w14 w15 w16se w16cid w16 w16cex wp14">
   <w:body>
     <w:p>
       <w:pPr>
@@ -86,7 +86,19 @@
         <w:pStyle w:val="NormalWeb"/>
       </w:pPr>
       <w:r>
-        <w:t>Căn cứ Bộ luật Dân sự năm 2015 và các quy định pháp luật liên quan; Căn cứ Luật Các tổ chức tín dụng hiện hành; Hợp Đồng Tín Dụng Kiêm Thế Chấp Sổ Tiết Kiệm này (sau đây gọi là "Hợp Đồng") được lập vào ngày …/…/2026 giữa và bởi Bên Vay ("Bên A") và Bên Cho Vay ("Bên B")</w:t>
+        <w:t xml:space="preserve">Căn cứ Bộ luật Dân sự năm 2015 và các quy định pháp luật liên quan; Căn cứ Luật Các tổ chức tín dụng hiện hành; Hợp Đồng Tín Dụng Kiêm Thế Chấp Sổ Tiết Kiệm này (sau đây gọi là "Hợp Đồng") được lập vào ngày </w:t>
+      </w:r>
+      <w:r>
+        <w:t>{{ngay_lap</w:t>
+      </w:r>
+      <w:r>
+        <w:t>_hop_dong</w:t>
+      </w:r>
+      <w:r>
+        <w:t>}}</w:t>
+      </w:r>
+      <w:r>
+        <w:t xml:space="preserve"> giữa và bởi Bên Vay ("Bên A") và Bên Cho Vay ("Bên B")</w:t>
       </w:r>
     </w:p>
     <w:p>
@@ -108,35 +120,13 @@
     <w:p>
       <w:pPr>
         <w:pStyle w:val="NormalWeb"/>
-        <w:rPr>
-          <w:lang w:val="en-US"/>
-        </w:rPr>
-      </w:pPr>
-      <w:r>
-        <w:rPr>
-          <w:b/>
-          <w:bCs/>
-          <w:lang w:val="en-US"/>
-        </w:rPr>
-        <w:t>{{</w:t>
-      </w:r>
-      <w:proofErr w:type="spellStart"/>
-      <w:r>
-        <w:rPr>
-          <w:b/>
-          <w:bCs/>
-          <w:lang w:val="en-US"/>
-        </w:rPr>
-        <w:t>ten_ben_vay</w:t>
-      </w:r>
-      <w:proofErr w:type="spellEnd"/>
-      <w:r>
-        <w:rPr>
-          <w:b/>
-          <w:bCs/>
-          <w:lang w:val="en-US"/>
-        </w:rPr>
-        <w:t>}}</w:t>
+      </w:pPr>
+      <w:r>
+        <w:rPr>
+          <w:b/>
+          <w:bCs/>
+        </w:rPr>
+        <w:t>{{ten_ben_vay}}</w:t>
       </w:r>
     </w:p>
     <w:p>
@@ -150,69 +140,18 @@
         <w:t xml:space="preserve">Địa chỉ: </w:t>
       </w:r>
       <w:r>
-        <w:rPr>
-          <w:lang w:val="en-US"/>
-        </w:rPr>
-        <w:t>{{</w:t>
-      </w:r>
-      <w:proofErr w:type="spellStart"/>
-      <w:r>
-        <w:rPr>
-          <w:lang w:val="en-US"/>
-        </w:rPr>
-        <w:t>dia_chi</w:t>
-      </w:r>
-      <w:proofErr w:type="spellEnd"/>
-      <w:r>
-        <w:rPr>
-          <w:lang w:val="en-US"/>
-        </w:rPr>
-        <w:t>}}</w:t>
+        <w:t>{{dia_chi}}</w:t>
       </w:r>
       <w:r>
         <w:t xml:space="preserve"> Điện thoại: </w:t>
       </w:r>
       <w:r>
-        <w:rPr>
-          <w:lang w:val="en-US"/>
-        </w:rPr>
-        <w:t>{{</w:t>
-      </w:r>
-      <w:proofErr w:type="spellStart"/>
-      <w:r>
-        <w:rPr>
-          <w:lang w:val="en-US"/>
-        </w:rPr>
-        <w:t>so_dien_thoại</w:t>
-      </w:r>
-      <w:proofErr w:type="spellEnd"/>
-      <w:r>
-        <w:rPr>
-          <w:lang w:val="en-US"/>
-        </w:rPr>
-        <w:t>}}</w:t>
-      </w:r>
-      <w:r>
-        <w:t xml:space="preserve"> Fax: </w:t>
-      </w:r>
-      <w:r>
-        <w:rPr>
-          <w:lang w:val="en-US"/>
-        </w:rPr>
-        <w:t>{{</w:t>
-      </w:r>
-      <w:proofErr w:type="spellStart"/>
-      <w:r>
-        <w:rPr>
-          <w:lang w:val="en-US"/>
-        </w:rPr>
-        <w:t>ma_fax</w:t>
-      </w:r>
-      <w:proofErr w:type="spellEnd"/>
-      <w:r>
-        <w:rPr>
-          <w:lang w:val="en-US"/>
-        </w:rPr>
+        <w:t>{{so_dien_</w:t>
+      </w:r>
+      <w:r>
+        <w:t>thoai</w:t>
+      </w:r>
+      <w:r>
         <w:t>}}</w:t>
       </w:r>
       <w:r>
@@ -230,24 +169,10 @@
         <w:t xml:space="preserve">Mã số doanh nghiệp: </w:t>
       </w:r>
       <w:r>
-        <w:rPr>
-          <w:lang w:val="en-US"/>
-        </w:rPr>
         <w:t>{</w:t>
       </w:r>
-      <w:proofErr w:type="spellStart"/>
-      <w:r>
-        <w:rPr>
-          <w:lang w:val="en-US"/>
-        </w:rPr>
-        <w:t>ma_so_doanh_nghiep</w:t>
-      </w:r>
-      <w:proofErr w:type="spellEnd"/>
-      <w:r>
-        <w:rPr>
-          <w:lang w:val="en-US"/>
-        </w:rPr>
-        <w:t>}}</w:t>
+      <w:r>
+        <w:t>{ma_so_doanh_nghiep}}</w:t>
       </w:r>
       <w:r>
         <w:t xml:space="preserve"> </w:t>
@@ -264,47 +189,13 @@
         <w:t xml:space="preserve">Số tài khoản: </w:t>
       </w:r>
       <w:r>
-        <w:rPr>
-          <w:lang w:val="en-US"/>
-        </w:rPr>
-        <w:t>{{</w:t>
-      </w:r>
-      <w:proofErr w:type="spellStart"/>
-      <w:r>
-        <w:rPr>
-          <w:lang w:val="en-US"/>
-        </w:rPr>
-        <w:t>so_tai_khoan</w:t>
-      </w:r>
-      <w:proofErr w:type="spellEnd"/>
-      <w:r>
-        <w:rPr>
-          <w:lang w:val="en-US"/>
-        </w:rPr>
-        <w:t>}}</w:t>
+        <w:t>{{so_tai_khoan}}</w:t>
       </w:r>
       <w:r>
         <w:t xml:space="preserve"> tại Ngân hàng </w:t>
       </w:r>
       <w:r>
-        <w:rPr>
-          <w:lang w:val="en-US"/>
-        </w:rPr>
-        <w:t>{{</w:t>
-      </w:r>
-      <w:proofErr w:type="spellStart"/>
-      <w:r>
-        <w:rPr>
-          <w:lang w:val="en-US"/>
-        </w:rPr>
-        <w:t>ten_chi_nhanh</w:t>
-      </w:r>
-      <w:proofErr w:type="spellEnd"/>
-      <w:r>
-        <w:rPr>
-          <w:lang w:val="en-US"/>
-        </w:rPr>
-        <w:t>}}</w:t>
+        <w:t>{{ten_chi_nhanh}}</w:t>
       </w:r>
       <w:r>
         <w:t xml:space="preserve"> </w:t>
@@ -321,47 +212,13 @@
         <w:t xml:space="preserve">Người đại diện: </w:t>
       </w:r>
       <w:r>
-        <w:rPr>
-          <w:lang w:val="en-US"/>
-        </w:rPr>
-        <w:t>{{</w:t>
-      </w:r>
-      <w:proofErr w:type="spellStart"/>
-      <w:r>
-        <w:rPr>
-          <w:lang w:val="en-US"/>
-        </w:rPr>
-        <w:t>ten_nguoi_dai_dien_ben_vay</w:t>
-      </w:r>
-      <w:proofErr w:type="spellEnd"/>
-      <w:r>
-        <w:rPr>
-          <w:lang w:val="en-US"/>
-        </w:rPr>
-        <w:t>}}</w:t>
+        <w:t>{{ten_nguoi_dai_dien_ben_vay}}</w:t>
       </w:r>
       <w:r>
         <w:t xml:space="preserve"> Chức vụ: </w:t>
       </w:r>
       <w:r>
-        <w:rPr>
-          <w:lang w:val="en-US"/>
-        </w:rPr>
-        <w:t>{{</w:t>
-      </w:r>
-      <w:proofErr w:type="spellStart"/>
-      <w:r>
-        <w:rPr>
-          <w:lang w:val="en-US"/>
-        </w:rPr>
-        <w:t>chuc_vu_nguoi_dai_dien_ben_vay</w:t>
-      </w:r>
-      <w:proofErr w:type="spellEnd"/>
-      <w:r>
-        <w:rPr>
-          <w:lang w:val="en-US"/>
-        </w:rPr>
-        <w:t>}}</w:t>
+        <w:t>{{chuc_vu_nguoi_dai_dien_ben_vay}}</w:t>
       </w:r>
       <w:r>
         <w:t xml:space="preserve"> </w:t>
@@ -378,101 +235,25 @@
         <w:t>Số CCCD</w:t>
       </w:r>
       <w:r>
-        <w:rPr>
-          <w:lang w:val="en-US"/>
-        </w:rPr>
-        <w:t>/</w:t>
-      </w:r>
-      <w:proofErr w:type="spellStart"/>
-      <w:r>
-        <w:rPr>
-          <w:lang w:val="en-US"/>
-        </w:rPr>
-        <w:t>Hộ</w:t>
-      </w:r>
-      <w:proofErr w:type="spellEnd"/>
-      <w:r>
-        <w:rPr>
-          <w:lang w:val="en-US"/>
-        </w:rPr>
-        <w:t xml:space="preserve"> </w:t>
-      </w:r>
-      <w:proofErr w:type="spellStart"/>
-      <w:r>
-        <w:rPr>
-          <w:lang w:val="en-US"/>
-        </w:rPr>
-        <w:t>chiếu</w:t>
-      </w:r>
-      <w:proofErr w:type="spellEnd"/>
+        <w:t>/Hộ chiếu</w:t>
+      </w:r>
       <w:r>
         <w:t xml:space="preserve">: </w:t>
       </w:r>
       <w:r>
-        <w:rPr>
-          <w:lang w:val="en-US"/>
-        </w:rPr>
-        <w:t>{{</w:t>
-      </w:r>
-      <w:proofErr w:type="spellStart"/>
-      <w:r>
-        <w:rPr>
-          <w:lang w:val="en-US"/>
-        </w:rPr>
-        <w:t>so_CCCD</w:t>
-      </w:r>
-      <w:proofErr w:type="spellEnd"/>
-      <w:r>
-        <w:rPr>
-          <w:lang w:val="en-US"/>
-        </w:rPr>
-        <w:t>}}</w:t>
+        <w:t>{{so_CCCD}}</w:t>
       </w:r>
       <w:r>
         <w:t xml:space="preserve"> Ngày cấp: </w:t>
       </w:r>
       <w:r>
-        <w:rPr>
-          <w:lang w:val="en-US"/>
-        </w:rPr>
-        <w:t>{{</w:t>
-      </w:r>
-      <w:proofErr w:type="spellStart"/>
-      <w:r>
-        <w:rPr>
-          <w:lang w:val="en-US"/>
-        </w:rPr>
-        <w:t>ngay_cap_CCCD</w:t>
-      </w:r>
-      <w:proofErr w:type="spellEnd"/>
-      <w:r>
-        <w:rPr>
-          <w:lang w:val="en-US"/>
-        </w:rPr>
-        <w:t>}}</w:t>
+        <w:t>{{ngay_cap_CCCD}}</w:t>
       </w:r>
       <w:r>
         <w:t xml:space="preserve"> Nơi cấp: </w:t>
       </w:r>
       <w:r>
-        <w:rPr>
-          <w:lang w:val="en-US"/>
-        </w:rPr>
-        <w:t>{{</w:t>
-      </w:r>
-      <w:proofErr w:type="spellStart"/>
-      <w:r>
-        <w:rPr>
-          <w:lang w:val="en-US"/>
-        </w:rPr>
-        <w:t>noi_cap_CCCD</w:t>
-      </w:r>
-      <w:proofErr w:type="spellEnd"/>
-      <w:r>
-        <w:rPr>
-          <w:lang w:val="en-US"/>
-        </w:rPr>
-        <w:t>}}</w:t>
+        <w:t>{{noi_cap_CCCD}}</w:t>
       </w:r>
       <w:r>
         <w:t xml:space="preserve"> (Sau đây gọi là </w:t>
@@ -540,7 +321,6 @@
         <w:rPr>
           <w:b/>
           <w:bCs/>
-          <w:lang w:val="en-US"/>
         </w:rPr>
         <w:t>TRỤ SỞ CHÍNH</w:t>
       </w:r>
@@ -557,191 +337,17 @@
         <w:rPr>
           <w:b/>
           <w:bCs/>
-          <w:lang w:val="en-US"/>
         </w:rPr>
       </w:pPr>
       <w:r>
         <w:t xml:space="preserve">Địa chỉ: </w:t>
       </w:r>
-      <w:proofErr w:type="spellStart"/>
-      <w:r>
-        <w:rPr>
-          <w:b/>
-          <w:bCs/>
-          <w:lang w:val="en-US"/>
-        </w:rPr>
-        <w:t>Số</w:t>
-      </w:r>
-      <w:proofErr w:type="spellEnd"/>
-      <w:r>
-        <w:rPr>
-          <w:b/>
-          <w:bCs/>
-          <w:lang w:val="en-US"/>
-        </w:rPr>
-        <w:t xml:space="preserve"> 2 </w:t>
-      </w:r>
-      <w:proofErr w:type="spellStart"/>
-      <w:r>
-        <w:rPr>
-          <w:b/>
-          <w:bCs/>
-          <w:lang w:val="en-US"/>
-        </w:rPr>
-        <w:t>Láng</w:t>
-      </w:r>
-      <w:proofErr w:type="spellEnd"/>
-      <w:r>
-        <w:rPr>
-          <w:b/>
-          <w:bCs/>
-          <w:lang w:val="en-US"/>
-        </w:rPr>
-        <w:t xml:space="preserve"> </w:t>
-      </w:r>
-      <w:proofErr w:type="spellStart"/>
-      <w:r>
-        <w:rPr>
-          <w:b/>
-          <w:bCs/>
-          <w:lang w:val="en-US"/>
-        </w:rPr>
-        <w:t>Hạ</w:t>
-      </w:r>
-      <w:proofErr w:type="spellEnd"/>
-      <w:r>
-        <w:rPr>
-          <w:b/>
-          <w:bCs/>
-          <w:lang w:val="en-US"/>
-        </w:rPr>
-        <w:t xml:space="preserve">, </w:t>
-      </w:r>
-      <w:proofErr w:type="spellStart"/>
-      <w:r>
-        <w:rPr>
-          <w:b/>
-          <w:bCs/>
-          <w:lang w:val="en-US"/>
-        </w:rPr>
-        <w:t>phường</w:t>
-      </w:r>
-      <w:proofErr w:type="spellEnd"/>
-      <w:r>
-        <w:rPr>
-          <w:b/>
-          <w:bCs/>
-          <w:lang w:val="en-US"/>
-        </w:rPr>
-        <w:t xml:space="preserve"> </w:t>
-      </w:r>
-      <w:proofErr w:type="spellStart"/>
-      <w:r>
-        <w:rPr>
-          <w:b/>
-          <w:bCs/>
-          <w:lang w:val="en-US"/>
-        </w:rPr>
-        <w:t>Giảng</w:t>
-      </w:r>
-      <w:proofErr w:type="spellEnd"/>
-      <w:r>
-        <w:rPr>
-          <w:b/>
-          <w:bCs/>
-          <w:lang w:val="en-US"/>
-        </w:rPr>
-        <w:t xml:space="preserve"> </w:t>
-      </w:r>
-      <w:proofErr w:type="spellStart"/>
-      <w:r>
-        <w:rPr>
-          <w:b/>
-          <w:bCs/>
-          <w:lang w:val="en-US"/>
-        </w:rPr>
-        <w:t>Võ</w:t>
-      </w:r>
-      <w:proofErr w:type="spellEnd"/>
-      <w:r>
-        <w:rPr>
-          <w:b/>
-          <w:bCs/>
-          <w:lang w:val="en-US"/>
-        </w:rPr>
-        <w:t xml:space="preserve">, </w:t>
-      </w:r>
-      <w:proofErr w:type="spellStart"/>
-      <w:r>
-        <w:rPr>
-          <w:b/>
-          <w:bCs/>
-          <w:lang w:val="en-US"/>
-        </w:rPr>
-        <w:t>thành</w:t>
-      </w:r>
-      <w:proofErr w:type="spellEnd"/>
-      <w:r>
-        <w:rPr>
-          <w:b/>
-          <w:bCs/>
-          <w:lang w:val="en-US"/>
-        </w:rPr>
-        <w:t xml:space="preserve"> </w:t>
-      </w:r>
-      <w:proofErr w:type="spellStart"/>
-      <w:r>
-        <w:rPr>
-          <w:b/>
-          <w:bCs/>
-          <w:lang w:val="en-US"/>
-        </w:rPr>
-        <w:t>phố</w:t>
-      </w:r>
-      <w:proofErr w:type="spellEnd"/>
-      <w:r>
-        <w:rPr>
-          <w:b/>
-          <w:bCs/>
-          <w:lang w:val="en-US"/>
-        </w:rPr>
-        <w:t xml:space="preserve"> </w:t>
-      </w:r>
-      <w:proofErr w:type="spellStart"/>
-      <w:r>
-        <w:rPr>
-          <w:b/>
-          <w:bCs/>
-          <w:lang w:val="en-US"/>
-        </w:rPr>
-        <w:t>Hà</w:t>
-      </w:r>
-      <w:proofErr w:type="spellEnd"/>
-      <w:r>
-        <w:rPr>
-          <w:b/>
-          <w:bCs/>
-          <w:lang w:val="en-US"/>
-        </w:rPr>
-        <w:t xml:space="preserve"> </w:t>
-      </w:r>
-      <w:proofErr w:type="spellStart"/>
-      <w:r>
-        <w:rPr>
-          <w:b/>
-          <w:bCs/>
-          <w:lang w:val="en-US"/>
-        </w:rPr>
-        <w:t>Nội</w:t>
-      </w:r>
-      <w:proofErr w:type="spellEnd"/>
-      <w:r>
-        <w:rPr>
-          <w:b/>
-          <w:bCs/>
-          <w:lang w:val="en-US"/>
-        </w:rPr>
-        <w:t xml:space="preserve"> </w:t>
+      <w:r>
+        <w:rPr>
+          <w:b/>
+          <w:bCs/>
+        </w:rPr>
+        <w:t xml:space="preserve">Số 2 Láng Hạ, phường Giảng Võ, thành phố Hà Nội </w:t>
       </w:r>
     </w:p>
     <w:p>
@@ -750,9 +356,6 @@
         <w:snapToGrid w:val="0"/>
         <w:spacing w:line="360" w:lineRule="auto"/>
         <w:contextualSpacing/>
-        <w:rPr>
-          <w:lang w:val="en-US"/>
-        </w:rPr>
       </w:pPr>
       <w:r>
         <w:t xml:space="preserve">Điện thoại: </w:t>
@@ -761,14 +364,10 @@
         <w:rPr>
           <w:b/>
           <w:bCs/>
-          <w:lang w:val="en-US"/>
         </w:rPr>
         <w:t>0243.8314.562</w:t>
       </w:r>
       <w:r>
-        <w:rPr>
-          <w:lang w:val="en-US"/>
-        </w:rPr>
         <w:t xml:space="preserve"> </w:t>
       </w:r>
     </w:p>
@@ -782,58 +381,26 @@
       <w:r>
         <w:t xml:space="preserve">Người đại diện: </w:t>
       </w:r>
-      <w:proofErr w:type="spellStart"/>
-      <w:r>
-        <w:rPr>
-          <w:b/>
-          <w:bCs/>
-          <w:lang w:val="en-US"/>
-        </w:rPr>
-        <w:t>Nguyễn</w:t>
-      </w:r>
-      <w:proofErr w:type="spellEnd"/>
-      <w:r>
-        <w:rPr>
-          <w:b/>
-          <w:bCs/>
-          <w:lang w:val="en-US"/>
-        </w:rPr>
+      <w:r>
+        <w:rPr>
+          <w:b/>
+          <w:bCs/>
+        </w:rPr>
+        <w:t>Nguyễn Văn A</w:t>
+      </w:r>
+      <w:r>
+        <w:t xml:space="preserve"> Chức vụ: </w:t>
+      </w:r>
+      <w:r>
+        <w:rPr>
+          <w:b/>
+          <w:bCs/>
+        </w:rPr>
+        <w:t>Giám đốc</w:t>
+      </w:r>
+      <w:r>
         <w:t xml:space="preserve"> </w:t>
       </w:r>
-      <w:proofErr w:type="spellStart"/>
-      <w:r>
-        <w:rPr>
-          <w:b/>
-          <w:bCs/>
-          <w:lang w:val="en-US"/>
-        </w:rPr>
-        <w:t>Văn</w:t>
-      </w:r>
-      <w:proofErr w:type="spellEnd"/>
-      <w:r>
-        <w:rPr>
-          <w:b/>
-          <w:bCs/>
-          <w:lang w:val="en-US"/>
-        </w:rPr>
-        <w:t xml:space="preserve"> A</w:t>
-      </w:r>
-      <w:r>
-        <w:t xml:space="preserve"> Chức vụ: </w:t>
-      </w:r>
-      <w:r>
-        <w:rPr>
-          <w:b/>
-          <w:bCs/>
-        </w:rPr>
-        <w:t>Giám đốc</w:t>
-      </w:r>
-      <w:r>
-        <w:rPr>
-          <w:lang w:val="en-US"/>
-        </w:rPr>
-        <w:t xml:space="preserve"> </w:t>
-      </w:r>
       <w:r>
         <w:t xml:space="preserve">(Sau đây gọi là </w:t>
       </w:r>
@@ -872,47 +439,13 @@
         <w:t xml:space="preserve"> 1.1. Bên B đồng ý cấp tín dụng cho Bên A một khoản vay bằng Đồng Việt Nam có giá trị là: </w:t>
       </w:r>
       <w:r>
-        <w:rPr>
-          <w:lang w:val="en-US"/>
-        </w:rPr>
-        <w:t>{{</w:t>
-      </w:r>
-      <w:proofErr w:type="spellStart"/>
-      <w:r>
-        <w:rPr>
-          <w:lang w:val="en-US"/>
-        </w:rPr>
-        <w:t>so_tien_vay</w:t>
-      </w:r>
-      <w:proofErr w:type="spellEnd"/>
-      <w:r>
-        <w:rPr>
-          <w:lang w:val="en-US"/>
-        </w:rPr>
-        <w:t>}}</w:t>
+        <w:t>{{so_tien_vay}}</w:t>
       </w:r>
       <w:r>
         <w:t xml:space="preserve"> VNĐ (Bằng chữ: </w:t>
       </w:r>
       <w:r>
-        <w:rPr>
-          <w:lang w:val="en-US"/>
-        </w:rPr>
-        <w:t>{{</w:t>
-      </w:r>
-      <w:proofErr w:type="spellStart"/>
-      <w:r>
-        <w:rPr>
-          <w:lang w:val="en-US"/>
-        </w:rPr>
-        <w:t>so_tien_vay_bang_chu</w:t>
-      </w:r>
-      <w:proofErr w:type="spellEnd"/>
-      <w:r>
-        <w:rPr>
-          <w:lang w:val="en-US"/>
-        </w:rPr>
-        <w:t>}}</w:t>
+        <w:t>{{so_tien_vay_bang_chu}}</w:t>
       </w:r>
       <w:r>
         <w:t xml:space="preserve"> (Sau đây gọi là </w:t>
@@ -943,47 +476,13 @@
         <w:t xml:space="preserve"> 2.1. Thời hạn vay: </w:t>
       </w:r>
       <w:r>
-        <w:rPr>
-          <w:lang w:val="en-US"/>
-        </w:rPr>
-        <w:t>{{</w:t>
-      </w:r>
-      <w:proofErr w:type="spellStart"/>
-      <w:r>
-        <w:rPr>
-          <w:lang w:val="en-US"/>
-        </w:rPr>
-        <w:t>thoi_han_vay</w:t>
-      </w:r>
-      <w:proofErr w:type="spellEnd"/>
-      <w:r>
-        <w:rPr>
-          <w:lang w:val="en-US"/>
-        </w:rPr>
-        <w:t>}}</w:t>
+        <w:t>{{thoi_han_vay}}</w:t>
       </w:r>
       <w:r>
         <w:t xml:space="preserve"> tháng, kể từ ngày giải ngân đầu tiên. 2.2. Lãi suất cho vay: </w:t>
       </w:r>
       <w:r>
-        <w:rPr>
-          <w:lang w:val="en-US"/>
-        </w:rPr>
-        <w:t>{{</w:t>
-      </w:r>
-      <w:proofErr w:type="spellStart"/>
-      <w:r>
-        <w:rPr>
-          <w:lang w:val="en-US"/>
-        </w:rPr>
-        <w:t>lai_suat</w:t>
-      </w:r>
-      <w:proofErr w:type="spellEnd"/>
-      <w:r>
-        <w:rPr>
-          <w:lang w:val="en-US"/>
-        </w:rPr>
-        <w:t>}}</w:t>
+        <w:t>{{lai_suat}}</w:t>
       </w:r>
       <w:r>
         <w:t xml:space="preserve"> %/năm. Lãi suất này có thể </w:t>
@@ -1032,24 +531,7 @@
         <w:t xml:space="preserve">Số seri/Số thẻ/Số tài khoản tiền gửi: </w:t>
       </w:r>
       <w:r>
-        <w:rPr>
-          <w:lang w:val="en-US"/>
-        </w:rPr>
-        <w:t>{{</w:t>
-      </w:r>
-      <w:proofErr w:type="spellStart"/>
-      <w:r>
-        <w:rPr>
-          <w:lang w:val="en-US"/>
-        </w:rPr>
-        <w:t>seri_so_tiet_kiem</w:t>
-      </w:r>
-      <w:proofErr w:type="spellEnd"/>
-      <w:r>
-        <w:rPr>
-          <w:lang w:val="en-US"/>
-        </w:rPr>
-        <w:t>}}</w:t>
+        <w:t>{{seri_so_tiet_kiem}}</w:t>
       </w:r>
     </w:p>
     <w:p>
@@ -1064,59 +546,13 @@
         <w:t xml:space="preserve">Số tiền gửi: </w:t>
       </w:r>
       <w:r>
-        <w:rPr>
-          <w:lang w:val="en-US"/>
-        </w:rPr>
-        <w:t>{{</w:t>
-      </w:r>
-      <w:proofErr w:type="spellStart"/>
-      <w:r>
-        <w:rPr>
-          <w:lang w:val="en-US"/>
-        </w:rPr>
-        <w:t>so_tien_gui_tiet_kiem</w:t>
-      </w:r>
-      <w:proofErr w:type="spellEnd"/>
-      <w:r>
-        <w:rPr>
-          <w:lang w:val="en-US"/>
-        </w:rPr>
-        <w:t>}}</w:t>
+        <w:t>{{so_tien_gui_tiet_kiem}}</w:t>
       </w:r>
       <w:r>
         <w:t xml:space="preserve"> VNĐ (Bằng chữ: </w:t>
       </w:r>
       <w:r>
-        <w:rPr>
-          <w:lang w:val="en-US"/>
-        </w:rPr>
-        <w:t>{{</w:t>
-      </w:r>
-      <w:proofErr w:type="spellStart"/>
-      <w:r>
-        <w:rPr>
-          <w:lang w:val="en-US"/>
-        </w:rPr>
-        <w:t>so_tien_gui_tiet_kiem</w:t>
-      </w:r>
-      <w:r>
-        <w:rPr>
-          <w:lang w:val="en-US"/>
-        </w:rPr>
-        <w:t>_bang_chu</w:t>
-      </w:r>
-      <w:proofErr w:type="spellEnd"/>
-      <w:r>
-        <w:rPr>
-          <w:lang w:val="en-US"/>
-        </w:rPr>
-        <w:t>}}</w:t>
-      </w:r>
-      <w:r>
-        <w:rPr>
-          <w:lang w:val="en-US"/>
-        </w:rPr>
-        <w:t>)</w:t>
+        <w:t>{{so_tien_gui_tiet_kiem_bang_chu}})</w:t>
       </w:r>
     </w:p>
     <w:p>
@@ -1131,47 +567,13 @@
         <w:t xml:space="preserve">Ngày phát hành: </w:t>
       </w:r>
       <w:r>
-        <w:rPr>
-          <w:lang w:val="en-US"/>
-        </w:rPr>
-        <w:t>{{</w:t>
-      </w:r>
-      <w:proofErr w:type="spellStart"/>
-      <w:r>
-        <w:rPr>
-          <w:lang w:val="en-US"/>
-        </w:rPr>
-        <w:t>ngay_phat_hanh</w:t>
-      </w:r>
-      <w:proofErr w:type="spellEnd"/>
-      <w:r>
-        <w:rPr>
-          <w:lang w:val="en-US"/>
-        </w:rPr>
-        <w:t>}}</w:t>
+        <w:t>{{ngay_phat_hanh}}</w:t>
       </w:r>
       <w:r>
         <w:t xml:space="preserve"> Ngày đến hạn: </w:t>
       </w:r>
       <w:r>
-        <w:rPr>
-          <w:lang w:val="en-US"/>
-        </w:rPr>
-        <w:t>{{</w:t>
-      </w:r>
-      <w:proofErr w:type="spellStart"/>
-      <w:r>
-        <w:rPr>
-          <w:lang w:val="en-US"/>
-        </w:rPr>
-        <w:t>ngay_den_han</w:t>
-      </w:r>
-      <w:proofErr w:type="spellEnd"/>
-      <w:r>
-        <w:rPr>
-          <w:lang w:val="en-US"/>
-        </w:rPr>
-        <w:t>}}</w:t>
+        <w:t>{{ngay_den_han}}</w:t>
       </w:r>
     </w:p>
     <w:p>
@@ -1442,7 +844,7 @@
 </file>
 
 <file path=word/numbering.xml><?xml version="1.0" encoding="utf-8"?>
-<w:numbering xmlns:wpc="http://schemas.microsoft.com/office/word/2010/wordprocessingCanvas" xmlns:cx="http://schemas.microsoft.com/office/drawing/2014/chartex" xmlns:cx1="http://schemas.microsoft.com/office/drawing/2015/9/8/chartex" xmlns:cx2="http://schemas.microsoft.com/office/drawing/2015/10/21/chartex" xmlns:cx3="http://schemas.microsoft.com/office/drawing/2016/5/9/chartex" xmlns:cx4="http://schemas.microsoft.com/office/drawing/2016/5/10/chartex" xmlns:cx5="http://schemas.microsoft.com/office/drawing/2016/5/11/chartex" xmlns:cx6="http://schemas.microsoft.com/office/drawing/2016/5/12/chartex" xmlns:cx7="http://schemas.microsoft.com/office/drawing/2016/5/13/chartex" xmlns:cx8="http://schemas.microsoft.com/office/drawing/2016/5/14/chartex" xmlns:mc="http://schemas.openxmlformats.org/markup-compatibility/2006" xmlns:aink="http://schemas.microsoft.com/office/drawing/2016/ink" xmlns:am3d="http://schemas.microsoft.com/office/drawing/2017/model3d" xmlns:o="urn:schemas-microsoft-com:office:office" xmlns:oel="http://schemas.microsoft.com/office/2019/extlst" xmlns:r="http://schemas.openxmlformats.org/officeDocument/2006/relationships" xmlns:m="http://schemas.openxmlformats.org/officeDocument/2006/math" xmlns:v="urn:schemas-microsoft-com:vml" xmlns:wp14="http://schemas.microsoft.com/office/word/2010/wordprocessingDrawing" xmlns:wp="http://schemas.openxmlformats.org/drawingml/2006/wordprocessingDrawing" xmlns:w10="urn:schemas-microsoft-com:office:word" xmlns:w="http://schemas.openxmlformats.org/wordprocessingml/2006/main" xmlns:w14="http://schemas.microsoft.com/office/word/2010/wordml" xmlns:w15="http://schemas.microsoft.com/office/word/2012/wordml" xmlns:w16cex="http://schemas.microsoft.com/office/word/2018/wordml/cex" xmlns:w16cid="http://schemas.microsoft.com/office/word/2016/wordml/cid" xmlns:w16="http://schemas.microsoft.com/office/word/2018/wordml" xmlns:w16sdtdh="http://schemas.microsoft.com/office/word/2020/wordml/sdtdatahash" xmlns:w16se="http://schemas.microsoft.com/office/word/2015/wordml/symex" xmlns:wpg="http://schemas.microsoft.com/office/word/2010/wordprocessingGroup" xmlns:wpi="http://schemas.microsoft.com/office/word/2010/wordprocessingInk" xmlns:wne="http://schemas.microsoft.com/office/word/2006/wordml" xmlns:wps="http://schemas.microsoft.com/office/word/2010/wordprocessingShape" mc:Ignorable="w14 w15 w16se w16cid w16 w16cex w16sdtdh wp14">
+<w:numbering xmlns:wpc="http://schemas.microsoft.com/office/word/2010/wordprocessingCanvas" xmlns:cx="http://schemas.microsoft.com/office/drawing/2014/chartex" xmlns:cx1="http://schemas.microsoft.com/office/drawing/2015/9/8/chartex" xmlns:cx2="http://schemas.microsoft.com/office/drawing/2015/10/21/chartex" xmlns:cx3="http://schemas.microsoft.com/office/drawing/2016/5/9/chartex" xmlns:cx4="http://schemas.microsoft.com/office/drawing/2016/5/10/chartex" xmlns:cx5="http://schemas.microsoft.com/office/drawing/2016/5/11/chartex" xmlns:cx6="http://schemas.microsoft.com/office/drawing/2016/5/12/chartex" xmlns:cx7="http://schemas.microsoft.com/office/drawing/2016/5/13/chartex" xmlns:cx8="http://schemas.microsoft.com/office/drawing/2016/5/14/chartex" xmlns:mc="http://schemas.openxmlformats.org/markup-compatibility/2006" xmlns:aink="http://schemas.microsoft.com/office/drawing/2016/ink" xmlns:am3d="http://schemas.microsoft.com/office/drawing/2017/model3d" xmlns:o="urn:schemas-microsoft-com:office:office" xmlns:r="http://schemas.openxmlformats.org/officeDocument/2006/relationships" xmlns:m="http://schemas.openxmlformats.org/officeDocument/2006/math" xmlns:v="urn:schemas-microsoft-com:vml" xmlns:wp14="http://schemas.microsoft.com/office/word/2010/wordprocessingDrawing" xmlns:wp="http://schemas.openxmlformats.org/drawingml/2006/wordprocessingDrawing" xmlns:w10="urn:schemas-microsoft-com:office:word" xmlns:w="http://schemas.openxmlformats.org/wordprocessingml/2006/main" xmlns:w14="http://schemas.microsoft.com/office/word/2010/wordml" xmlns:w15="http://schemas.microsoft.com/office/word/2012/wordml" xmlns:w16cex="http://schemas.microsoft.com/office/word/2018/wordml/cex" xmlns:w16cid="http://schemas.microsoft.com/office/word/2016/wordml/cid" xmlns:w16="http://schemas.microsoft.com/office/word/2018/wordml" xmlns:w16se="http://schemas.microsoft.com/office/word/2015/wordml/symex" xmlns:wpg="http://schemas.microsoft.com/office/word/2010/wordprocessingGroup" xmlns:wpi="http://schemas.microsoft.com/office/word/2010/wordprocessingInk" xmlns:wne="http://schemas.microsoft.com/office/word/2006/wordml" xmlns:wps="http://schemas.microsoft.com/office/word/2010/wordprocessingShape" mc:Ignorable="w14 w15 w16se w16cid w16 w16cex wp14">
   <w:abstractNum w:abstractNumId="0" w15:restartNumberingAfterBreak="0">
     <w:nsid w:val="23040B9E"/>
     <w:multiLevelType w:val="multilevel"/>
@@ -1592,14 +994,14 @@
       </w:rPr>
     </w:lvl>
   </w:abstractNum>
-  <w:num w:numId="1" w16cid:durableId="638733550">
+  <w:num w:numId="1">
     <w:abstractNumId w:val="0"/>
   </w:num>
 </w:numbering>
 </file>
 
 <file path=word/styles.xml><?xml version="1.0" encoding="utf-8"?>
-<w:styles xmlns:mc="http://schemas.openxmlformats.org/markup-compatibility/2006" xmlns:r="http://schemas.openxmlformats.org/officeDocument/2006/relationships" xmlns:w="http://schemas.openxmlformats.org/wordprocessingml/2006/main" xmlns:w14="http://schemas.microsoft.com/office/word/2010/wordml" xmlns:w15="http://schemas.microsoft.com/office/word/2012/wordml" xmlns:w16cex="http://schemas.microsoft.com/office/word/2018/wordml/cex" xmlns:w16cid="http://schemas.microsoft.com/office/word/2016/wordml/cid" xmlns:w16="http://schemas.microsoft.com/office/word/2018/wordml" xmlns:w16sdtdh="http://schemas.microsoft.com/office/word/2020/wordml/sdtdatahash" xmlns:w16se="http://schemas.microsoft.com/office/word/2015/wordml/symex" mc:Ignorable="w14 w15 w16se w16cid w16 w16cex w16sdtdh">
+<w:styles xmlns:mc="http://schemas.openxmlformats.org/markup-compatibility/2006" xmlns:r="http://schemas.openxmlformats.org/officeDocument/2006/relationships" xmlns:w="http://schemas.openxmlformats.org/wordprocessingml/2006/main" xmlns:w14="http://schemas.microsoft.com/office/word/2010/wordml" xmlns:w15="http://schemas.microsoft.com/office/word/2012/wordml" xmlns:w16cex="http://schemas.microsoft.com/office/word/2018/wordml/cex" xmlns:w16cid="http://schemas.microsoft.com/office/word/2016/wordml/cid" xmlns:w16="http://schemas.microsoft.com/office/word/2018/wordml" xmlns:w16se="http://schemas.microsoft.com/office/word/2015/wordml/symex" mc:Ignorable="w14 w15 w16se w16cid w16 w16cex">
   <w:docDefaults>
     <w:rPrDefault>
       <w:rPr>
@@ -1607,7 +1009,7 @@
         <w:kern w:val="2"/>
         <w:sz w:val="24"/>
         <w:szCs w:val="24"/>
-        <w:lang w:val="en-VN" w:eastAsia="en-US" w:bidi="ar-SA"/>
+        <w:lang w:val="en-US" w:eastAsia="en-US" w:bidi="ar-SA"/>
         <w14:ligatures w14:val="standardContextual"/>
       </w:rPr>
     </w:rPrDefault>

</xml_diff>

<commit_message>
Update last day 16_03
</commit_message>
<xml_diff>
--- a/src/main/resources/templates/Template_hop_dong_vay.docx
+++ b/src/main/resources/templates/Template_hop_dong_vay.docx
@@ -738,6 +738,14 @@
       <w:tblPr>
         <w:tblStyle w:val="TableGrid"/>
         <w:tblW w:w="0" w:type="auto"/>
+        <w:tblBorders>
+          <w:top w:val="none" w:sz="0" w:space="0" w:color="auto"/>
+          <w:left w:val="none" w:sz="0" w:space="0" w:color="auto"/>
+          <w:bottom w:val="none" w:sz="0" w:space="0" w:color="auto"/>
+          <w:right w:val="none" w:sz="0" w:space="0" w:color="auto"/>
+          <w:insideH w:val="none" w:sz="0" w:space="0" w:color="auto"/>
+          <w:insideV w:val="none" w:sz="0" w:space="0" w:color="auto"/>
+        </w:tblBorders>
         <w:tblLook w:val="04A0" w:firstRow="1" w:lastRow="0" w:firstColumn="1" w:lastColumn="0" w:noHBand="0" w:noVBand="1"/>
       </w:tblPr>
       <w:tblGrid>
@@ -774,11 +782,7 @@
               <w:jc w:val="center"/>
             </w:pPr>
             <w:r>
-              <w:rPr>
-                <w:i/>
-                <w:iCs/>
-              </w:rPr>
-              <w:t>(Chức danh Người đại diện)</w:t>
+              <w:t>{{chu_ky_ben_vay}}</w:t>
             </w:r>
           </w:p>
         </w:tc>
@@ -806,23 +810,10 @@
             <w:pPr>
               <w:pStyle w:val="NormalWeb"/>
               <w:jc w:val="center"/>
-              <w:rPr>
-                <w:i/>
-                <w:iCs/>
-              </w:rPr>
             </w:pPr>
             <w:r>
-              <w:rPr>
-                <w:i/>
-                <w:iCs/>
-              </w:rPr>
-              <w:t>(Chức danh Người đại diện)</w:t>
+              <w:t>{{dau_ngan_hang}}</w:t>
             </w:r>
-          </w:p>
-          <w:p>
-            <w:pPr>
-              <w:pStyle w:val="NormalWeb"/>
-            </w:pPr>
           </w:p>
         </w:tc>
       </w:tr>

</xml_diff>